<commit_message>
tjs-mike-offer: Stan pass, logo, Partner, Nov 9, drop legal chrome
</commit_message>
<xml_diff>
--- a/assets/tjs-mike-offer.docx
+++ b/assets/tjs-mike-offer.docx
@@ -4,65 +4,42 @@
   <w:body>
     <w:p>
       <w:pPr>
-        <w:spacing w:after="40" w:before="0" w:line="276" w:lineRule="auto"/>
+        <w:spacing w:after="80"/>
         <w:jc w:val="center"/>
       </w:pPr>
       <w:r>
-        <w:rPr>
-          <w:rFonts w:ascii="Calibri" w:hAnsi="Calibri"/>
-          <w:b/>
-          <w:i w:val="0"/>
-          <w:color w:val="1A2E3B"/>
-          <w:sz w:val="20"/>
-        </w:rPr>
-        <w:t>TJ'S LOG &amp; TIMBER</w:t>
-      </w:r>
-    </w:p>
-    <w:p>
-      <w:pPr>
-        <w:spacing w:after="40" w:before="0" w:line="276" w:lineRule="auto"/>
-        <w:jc w:val="center"/>
-      </w:pPr>
-      <w:r>
-        <w:rPr>
-          <w:rFonts w:ascii="Calibri" w:hAnsi="Calibri"/>
-          <w:b w:val="0"/>
-          <w:i w:val="0"/>
-          <w:color w:val="4A555A"/>
-          <w:sz w:val="20"/>
-        </w:rPr>
-        <w:t>Bailey, Colorado  ·  Employment Offer Letter</w:t>
-      </w:r>
-    </w:p>
-    <w:p>
-      <w:pPr>
-        <w:spacing w:after="200" w:before="0" w:line="276" w:lineRule="auto"/>
-        <w:jc w:val="center"/>
-      </w:pPr>
-      <w:r>
-        <w:rPr>
-          <w:rFonts w:ascii="Calibri" w:hAnsi="Calibri"/>
-          <w:b/>
-          <w:i w:val="0"/>
-          <w:color w:val="8B1E1E"/>
-          <w:sz w:val="20"/>
-        </w:rPr>
-        <w:t>DRAFT · NOT FOR EXECUTION</w:t>
-      </w:r>
-    </w:p>
-    <w:p>
-      <w:pPr>
-        <w:spacing w:after="240" w:before="0" w:line="276" w:lineRule="auto"/>
-      </w:pPr>
-      <w:r>
-        <w:rPr>
-          <w:rFonts w:ascii="Calibri" w:hAnsi="Calibri"/>
-          <w:b w:val="0"/>
-          <w:i/>
-          <w:color w:val="4A555A"/>
-          <w:sz w:val="18"/>
-        </w:rPr>
-        <w:t>This document was drafted by an AI legal agent as a starting point. It has not been reviewed by a licensed attorney. Before signing or distributing this document, it must be reviewed by a qualified attorney licensed in Colorado. Unbridled Solutions and MC make no representation that this document is legally sufficient or enforceable. Non-binding until attorney review and countersignature.</w:t>
+        <w:drawing>
+          <wp:inline xmlns:a="http://schemas.openxmlformats.org/drawingml/2006/main" xmlns:pic="http://schemas.openxmlformats.org/drawingml/2006/picture">
+            <wp:extent cx="2377440" cy="1229136"/>
+            <wp:docPr id="1" name="Picture 1"/>
+            <wp:cNvGraphicFramePr>
+              <a:graphicFrameLocks noChangeAspect="1"/>
+            </wp:cNvGraphicFramePr>
+            <a:graphic>
+              <a:graphicData uri="http://schemas.openxmlformats.org/drawingml/2006/picture">
+                <pic:pic>
+                  <pic:nvPicPr>
+                    <pic:cNvPr id="0" name="tjs-primary-black-whitebg.png"/>
+                    <pic:cNvPicPr/>
+                  </pic:nvPicPr>
+                  <pic:blipFill>
+                    <a:blip r:embed="rId10"/>
+                    <a:stretch>
+                      <a:fillRect/>
+                    </a:stretch>
+                  </pic:blipFill>
+                  <pic:spPr>
+                    <a:xfrm>
+                      <a:off x="0" y="0"/>
+                      <a:ext cx="2377440" cy="1229136"/>
+                    </a:xfrm>
+                    <a:prstGeom prst="rect"/>
+                  </pic:spPr>
+                </pic:pic>
+              </a:graphicData>
+            </a:graphic>
+          </wp:inline>
+        </w:drawing>
       </w:r>
     </w:p>
     <w:p>
@@ -75,10 +52,10 @@
           <w:rFonts w:ascii="Calibri" w:hAnsi="Calibri"/>
           <w:b/>
           <w:i w:val="0"/>
-          <w:color w:val="1A2E3B"/>
-          <w:sz w:val="36"/>
+          <w:color w:val="182D09"/>
+          <w:sz w:val="28"/>
         </w:rPr>
-        <w:t>Mike Gustafson</w:t>
+        <w:t>TJ's Log &amp; Timber</w:t>
       </w:r>
     </w:p>
     <w:p>
@@ -91,10 +68,58 @@
           <w:rFonts w:ascii="Calibri" w:hAnsi="Calibri"/>
           <w:b w:val="0"/>
           <w:i w:val="0"/>
-          <w:color w:val="4A555A"/>
+          <w:color w:val="6A5A42"/>
           <w:sz w:val="22"/>
         </w:rPr>
-        <w:t>General Manager  ·  W-2  ·  19 October 2026</w:t>
+        <w:t>Bailey, Colorado</w:t>
+      </w:r>
+    </w:p>
+    <w:p>
+      <w:pPr>
+        <w:spacing w:after="80" w:before="0" w:line="276" w:lineRule="auto"/>
+        <w:jc w:val="center"/>
+      </w:pPr>
+      <w:r>
+        <w:rPr>
+          <w:rFonts w:ascii="Calibri" w:hAnsi="Calibri"/>
+          <w:b/>
+          <w:i w:val="0"/>
+          <w:color w:val="AB5C2F"/>
+          <w:sz w:val="20"/>
+        </w:rPr>
+        <w:t>Offer Letter</w:t>
+      </w:r>
+    </w:p>
+    <w:p>
+      <w:pPr>
+        <w:spacing w:after="40" w:before="0" w:line="276" w:lineRule="auto"/>
+        <w:jc w:val="center"/>
+      </w:pPr>
+      <w:r>
+        <w:rPr>
+          <w:rFonts w:ascii="Calibri" w:hAnsi="Calibri"/>
+          <w:b/>
+          <w:i w:val="0"/>
+          <w:color w:val="182D09"/>
+          <w:sz w:val="36"/>
+        </w:rPr>
+        <w:t>Mike Gustafson</w:t>
+      </w:r>
+    </w:p>
+    <w:p>
+      <w:pPr>
+        <w:spacing w:after="320" w:before="0" w:line="276" w:lineRule="auto"/>
+        <w:jc w:val="center"/>
+      </w:pPr>
+      <w:r>
+        <w:rPr>
+          <w:rFonts w:ascii="Calibri" w:hAnsi="Calibri"/>
+          <w:b w:val="0"/>
+          <w:i w:val="0"/>
+          <w:color w:val="6A5A42"/>
+          <w:sz w:val="22"/>
+        </w:rPr>
+        <w:t>General Manager  ·  W-2 employee  ·  November 9, 2026</w:t>
       </w:r>
     </w:p>
     <w:p>
@@ -106,10 +131,10 @@
           <w:rFonts w:ascii="Calibri" w:hAnsi="Calibri"/>
           <w:b/>
           <w:i w:val="0"/>
-          <w:color w:val="1A2E3B"/>
-          <w:sz w:val="24"/>
+          <w:color w:val="182D09"/>
+          <w:sz w:val="22"/>
         </w:rPr>
-        <w:t>1.  Parties</w:t>
+        <w:t>POSITION</w:t>
       </w:r>
     </w:p>
     <w:p>
@@ -121,10 +146,25 @@
           <w:rFonts w:ascii="Calibri" w:hAnsi="Calibri"/>
           <w:b w:val="0"/>
           <w:i w:val="0"/>
-          <w:color w:val="1A1A1A"/>
+          <w:color w:val="4C3A23"/>
           <w:sz w:val="22"/>
         </w:rPr>
-        <w:t>Company: TJ's Log &amp; Timber, Bailey, Colorado mill. Legal SOS entity name to be confirmed. Stan Bullis, President, signs on behalf of the Company.</w:t>
+        <w:t>We offer you the position of General Manager as a W-2 employee of TJ's Log &amp; Timber, Bailey, Colorado.</w:t>
+      </w:r>
+    </w:p>
+    <w:p>
+      <w:pPr>
+        <w:spacing w:before="280" w:after="120"/>
+      </w:pPr>
+      <w:r>
+        <w:rPr>
+          <w:rFonts w:ascii="Calibri" w:hAnsi="Calibri"/>
+          <w:b/>
+          <w:i w:val="0"/>
+          <w:color w:val="182D09"/>
+          <w:sz w:val="22"/>
+        </w:rPr>
+        <w:t>START DATE</w:t>
       </w:r>
     </w:p>
     <w:p>
@@ -136,10 +176,10 @@
           <w:rFonts w:ascii="Calibri" w:hAnsi="Calibri"/>
           <w:b w:val="0"/>
           <w:i w:val="0"/>
-          <w:color w:val="1A1A1A"/>
+          <w:color w:val="4C3A23"/>
           <w:sz w:val="22"/>
         </w:rPr>
-        <w:t>Candidate: Mike Gustafson. Title: General Manager. Status: W-2 employee. This role does not include any equity, membership units, options, or ownership interest of any kind.</w:t>
+        <w:t>November 9, 2026.</w:t>
       </w:r>
     </w:p>
     <w:p>
@@ -151,10 +191,10 @@
           <w:rFonts w:ascii="Calibri" w:hAnsi="Calibri"/>
           <w:b/>
           <w:i w:val="0"/>
-          <w:color w:val="1A2E3B"/>
-          <w:sz w:val="24"/>
+          <w:color w:val="182D09"/>
+          <w:sz w:val="22"/>
         </w:rPr>
-        <w:t>2.  Start Date</w:t>
+        <w:t>BASE COMPENSATION</w:t>
       </w:r>
     </w:p>
     <w:p>
@@ -166,10 +206,10 @@
           <w:rFonts w:ascii="Calibri" w:hAnsi="Calibri"/>
           <w:b w:val="0"/>
           <w:i w:val="0"/>
-          <w:color w:val="1A1A1A"/>
+          <w:color w:val="4C3A23"/>
           <w:sz w:val="22"/>
         </w:rPr>
-        <w:t>Proposed start is on or before December 1, 2026, or such earlier date as the parties agree in writing. The exact start date must be confirmed in writing.</w:t>
+        <w:t>$120,000 per year, paid at the rate of $10,000 a month.</w:t>
       </w:r>
     </w:p>
     <w:p>
@@ -181,10 +221,10 @@
           <w:rFonts w:ascii="Calibri" w:hAnsi="Calibri"/>
           <w:b/>
           <w:i w:val="0"/>
-          <w:color w:val="1A2E3B"/>
-          <w:sz w:val="24"/>
+          <w:color w:val="182D09"/>
+          <w:sz w:val="22"/>
         </w:rPr>
-        <w:t>3.  Base Compensation</w:t>
+        <w:t>COMMISSION</w:t>
       </w:r>
     </w:p>
     <w:p>
@@ -196,25 +236,10 @@
           <w:rFonts w:ascii="Calibri" w:hAnsi="Calibri"/>
           <w:b w:val="0"/>
           <w:i w:val="0"/>
-          <w:color w:val="1A1A1A"/>
+          <w:color w:val="4C3A23"/>
           <w:sz w:val="22"/>
         </w:rPr>
-        <w:t>Your W-2 base salary will be One Hundred Twenty Thousand and 00/100 Dollars ($120,000.00) per year, paid at the rate of Ten Thousand and 00/100 Dollars ($10,000.00) per month in accordance with the Company's regular payroll schedule, subject to required withholdings.</w:t>
-      </w:r>
-    </w:p>
-    <w:p>
-      <w:pPr>
-        <w:spacing w:before="280" w:after="120"/>
-      </w:pPr>
-      <w:r>
-        <w:rPr>
-          <w:rFonts w:ascii="Calibri" w:hAnsi="Calibri"/>
-          <w:b/>
-          <w:i w:val="0"/>
-          <w:color w:val="1A2E3B"/>
-          <w:sz w:val="24"/>
-        </w:rPr>
-        <w:t>4.  Commission — 2% of Overall Sales</w:t>
+        <w:t>Two percent (2%) of total company gross sales.</w:t>
       </w:r>
     </w:p>
     <w:p>
@@ -226,10 +251,10 @@
           <w:rFonts w:ascii="Calibri" w:hAnsi="Calibri"/>
           <w:b w:val="0"/>
           <w:i w:val="0"/>
-          <w:color w:val="1A1A1A"/>
+          <w:color w:val="4C3A23"/>
           <w:sz w:val="22"/>
         </w:rPr>
-        <w:t>You will receive a commission equal to two percent (2%) of Company gross sales (all revenue, not limited to sales you personally close). This commission is payable on a project only if actual gross profit margin on that project is at least thirty-seven percent (37%). If actual gross profit margin on a project is below 37%, no 2% is due on that project's revenue.</w:t>
+        <w:t>Payable on a project only if actual gross profit margin on that project is 37% or greater.</w:t>
       </w:r>
     </w:p>
     <w:p>
@@ -241,10 +266,10 @@
           <w:rFonts w:ascii="Calibri" w:hAnsi="Calibri"/>
           <w:b w:val="0"/>
           <w:i w:val="0"/>
-          <w:color w:val="1A1A1A"/>
+          <w:color w:val="4C3A23"/>
           <w:sz w:val="22"/>
         </w:rPr>
-        <w:t>Gross profit margin means (Sale minus Direct cost of logs and materials minus Direct project labor) divided by Sale.</w:t>
+        <w:t>Gross profit margin means sale minus direct cost of logs and materials minus direct project labor, divided by sale.</w:t>
       </w:r>
     </w:p>
     <w:p>
@@ -256,10 +281,10 @@
           <w:rFonts w:ascii="Calibri" w:hAnsi="Calibri"/>
           <w:b w:val="0"/>
           <w:i w:val="0"/>
-          <w:color w:val="1A1A1A"/>
+          <w:color w:val="4C3A23"/>
           <w:sz w:val="22"/>
         </w:rPr>
-        <w:t>The Company uses the following planning allocation to underwrite a job. This is a target stack, not a guarantee of actual costs:</w:t>
+        <w:t>How we underwrite a job:</w:t>
       </w:r>
     </w:p>
     <w:tbl>
@@ -276,7 +301,7 @@
         <w:tc>
           <w:tcPr>
             <w:tcW w:type="dxa" w:w="4680"/>
-            <w:shd w:fill="E8EEF2" w:val="clear"/>
+            <w:shd w:fill="F8F4EA" w:val="clear"/>
           </w:tcPr>
           <w:p>
             <w:pPr>
@@ -287,17 +312,16 @@
                 <w:rFonts w:ascii="Calibri" w:hAnsi="Calibri"/>
                 <w:b/>
                 <w:i w:val="0"/>
-                <w:color w:val="1A2E3B"/>
+                <w:color w:val="182D09"/>
                 <w:sz w:val="20"/>
               </w:rPr>
-              <w:t>Planning stack</w:t>
             </w:r>
           </w:p>
         </w:tc>
         <w:tc>
           <w:tcPr>
             <w:tcW w:type="dxa" w:w="4680"/>
-            <w:shd w:fill="E8EEF2" w:val="clear"/>
+            <w:shd w:fill="F8F4EA" w:val="clear"/>
           </w:tcPr>
           <w:p>
             <w:pPr>
@@ -308,7 +332,7 @@
                 <w:rFonts w:ascii="Calibri" w:hAnsi="Calibri"/>
                 <w:b/>
                 <w:i w:val="0"/>
-                <w:color w:val="1A2E3B"/>
+                <w:color w:val="182D09"/>
                 <w:sz w:val="20"/>
               </w:rPr>
               <w:t>Share of sale</w:t>
@@ -330,7 +354,7 @@
                 <w:rFonts w:ascii="Calibri" w:hAnsi="Calibri"/>
                 <w:b w:val="0"/>
                 <w:i w:val="0"/>
-                <w:color w:val="1A1A1A"/>
+                <w:color w:val="4C3A23"/>
                 <w:sz w:val="20"/>
               </w:rPr>
               <w:t>Direct logs and materials</w:t>
@@ -350,7 +374,7 @@
                 <w:rFonts w:ascii="Calibri" w:hAnsi="Calibri"/>
                 <w:b w:val="0"/>
                 <w:i w:val="0"/>
-                <w:color w:val="1A1A1A"/>
+                <w:color w:val="4C3A23"/>
                 <w:sz w:val="20"/>
               </w:rPr>
               <w:t>26%</w:t>
@@ -372,7 +396,7 @@
                 <w:rFonts w:ascii="Calibri" w:hAnsi="Calibri"/>
                 <w:b w:val="0"/>
                 <w:i w:val="0"/>
-                <w:color w:val="1A1A1A"/>
+                <w:color w:val="4C3A23"/>
                 <w:sz w:val="20"/>
               </w:rPr>
               <w:t>Direct project labor</w:t>
@@ -392,7 +416,7 @@
                 <w:rFonts w:ascii="Calibri" w:hAnsi="Calibri"/>
                 <w:b w:val="0"/>
                 <w:i w:val="0"/>
-                <w:color w:val="1A1A1A"/>
+                <w:color w:val="4C3A23"/>
                 <w:sz w:val="20"/>
               </w:rPr>
               <w:t>37%</w:t>
@@ -414,7 +438,7 @@
                 <w:rFonts w:ascii="Calibri" w:hAnsi="Calibri"/>
                 <w:b w:val="0"/>
                 <w:i w:val="0"/>
-                <w:color w:val="1A1A1A"/>
+                <w:color w:val="4C3A23"/>
                 <w:sz w:val="20"/>
               </w:rPr>
               <w:t>Combined direct cost</w:t>
@@ -434,7 +458,7 @@
                 <w:rFonts w:ascii="Calibri" w:hAnsi="Calibri"/>
                 <w:b w:val="0"/>
                 <w:i w:val="0"/>
-                <w:color w:val="1A1A1A"/>
+                <w:color w:val="4C3A23"/>
                 <w:sz w:val="20"/>
               </w:rPr>
               <w:t>63%</w:t>
@@ -456,10 +480,10 @@
                 <w:rFonts w:ascii="Calibri" w:hAnsi="Calibri"/>
                 <w:b w:val="0"/>
                 <w:i w:val="0"/>
-                <w:color w:val="1A1A1A"/>
+                <w:color w:val="4C3A23"/>
                 <w:sz w:val="20"/>
               </w:rPr>
-              <w:t>Gross profit margin target / gate</w:t>
+              <w:t>Gross profit margin</w:t>
             </w:r>
           </w:p>
         </w:tc>
@@ -476,323 +500,10 @@
                 <w:rFonts w:ascii="Calibri" w:hAnsi="Calibri"/>
                 <w:b w:val="0"/>
                 <w:i w:val="0"/>
-                <w:color w:val="1A1A1A"/>
+                <w:color w:val="4C3A23"/>
                 <w:sz w:val="20"/>
               </w:rPr>
               <w:t>37%</w:t>
-            </w:r>
-          </w:p>
-        </w:tc>
-      </w:tr>
-    </w:tbl>
-    <w:p>
-      <w:pPr>
-        <w:spacing w:before="160" w:after="160"/>
-      </w:pPr>
-      <w:r>
-        <w:rPr>
-          <w:rFonts w:ascii="Calibri" w:hAnsi="Calibri"/>
-          <w:b w:val="0"/>
-          <w:i/>
-          <w:color w:val="1A1A1A"/>
-          <w:sz w:val="22"/>
-        </w:rPr>
-        <w:t>Illustration only. Not a promise of volume: 2% of $2,500,000 equals $50,000.</w:t>
-      </w:r>
-    </w:p>
-    <w:p>
-      <w:pPr>
-        <w:spacing w:before="280" w:after="120"/>
-      </w:pPr>
-      <w:r>
-        <w:rPr>
-          <w:rFonts w:ascii="Calibri" w:hAnsi="Calibri"/>
-          <w:b/>
-          <w:i w:val="0"/>
-          <w:color w:val="1A2E3B"/>
-          <w:sz w:val="24"/>
-        </w:rPr>
-        <w:t>5.  Profit Share — 20/20/60, then 10% of the 60%</w:t>
-      </w:r>
-    </w:p>
-    <w:p>
-      <w:pPr>
-        <w:spacing w:after="160" w:before="0" w:line="276" w:lineRule="auto"/>
-      </w:pPr>
-      <w:r>
-        <w:rPr>
-          <w:rFonts w:ascii="Calibri" w:hAnsi="Calibri"/>
-          <w:b w:val="0"/>
-          <w:i w:val="0"/>
-          <w:color w:val="1A1A1A"/>
-          <w:sz w:val="22"/>
-        </w:rPr>
-        <w:t>This is a W-2 bonus. It is not equity. It is not a K-1. It is not a grant of units.</w:t>
-      </w:r>
-    </w:p>
-    <w:p>
-      <w:pPr>
-        <w:spacing w:after="160" w:before="0" w:line="276" w:lineRule="auto"/>
-      </w:pPr>
-      <w:r>
-        <w:rPr>
-          <w:rFonts w:ascii="Calibri" w:hAnsi="Calibri"/>
-          <w:b w:val="0"/>
-          <w:i w:val="0"/>
-          <w:color w:val="1A1A1A"/>
-          <w:sz w:val="22"/>
-        </w:rPr>
-        <w:t>Of net operating income (NOI before this bonus, after ordinary operating expenses; counsel must lock the accounting definition), the Company allocates twenty percent (20%) to philanthropy (UnbridledACTS), twenty percent (20%) to reinvestment in the Company, and sixty percent (60%) to the people (owners/team) profit pool.</w:t>
-      </w:r>
-    </w:p>
-    <w:p>
-      <w:pPr>
-        <w:spacing w:after="160" w:before="0" w:line="276" w:lineRule="auto"/>
-      </w:pPr>
-      <w:r>
-        <w:rPr>
-          <w:rFonts w:ascii="Calibri" w:hAnsi="Calibri"/>
-          <w:b w:val="0"/>
-          <w:i w:val="0"/>
-          <w:color w:val="1A1A1A"/>
-          <w:sz w:val="22"/>
-        </w:rPr>
-        <w:t>You receive a W-2 profit-sharing bonus equal to ten percent (10%) of the sixty percent (60%) people allocation for that year. That is six percent (6%) of NOI after the 20/20/60 split is applied. If the Company has no positive NOI, this bonus is $0. Paid as W-2 compensation when the Company determines annual NOI, subject to counsel on definition and timing (suggested after year-end close).</w:t>
-      </w:r>
-    </w:p>
-    <w:p>
-      <w:pPr>
-        <w:spacing w:after="160" w:before="0" w:line="276" w:lineRule="auto"/>
-      </w:pPr>
-      <w:r>
-        <w:rPr>
-          <w:rFonts w:ascii="Calibri" w:hAnsi="Calibri"/>
-          <w:b w:val="0"/>
-          <w:i w:val="0"/>
-          <w:color w:val="1A1A1A"/>
-          <w:sz w:val="22"/>
-        </w:rPr>
-        <w:t>Illustration only, on $100 of NOI:</w:t>
-      </w:r>
-    </w:p>
-    <w:tbl>
-      <w:tblPr>
-        <w:tblStyle w:val="TableGrid"/>
-        <w:tblW w:type="auto" w:w="0"/>
-        <w:tblLook w:firstColumn="1" w:firstRow="1" w:lastColumn="0" w:lastRow="0" w:noHBand="0" w:noVBand="1" w:val="04A0"/>
-      </w:tblPr>
-      <w:tblGrid>
-        <w:gridCol w:w="4680"/>
-        <w:gridCol w:w="4680"/>
-      </w:tblGrid>
-      <w:tr>
-        <w:tc>
-          <w:tcPr>
-            <w:tcW w:type="dxa" w:w="4680"/>
-            <w:shd w:fill="E8EEF2" w:val="clear"/>
-          </w:tcPr>
-          <w:p>
-            <w:pPr>
-              <w:spacing w:after="40" w:before="40"/>
-            </w:pPr>
-            <w:r>
-              <w:rPr>
-                <w:rFonts w:ascii="Calibri" w:hAnsi="Calibri"/>
-                <w:b/>
-                <w:i w:val="0"/>
-                <w:color w:val="1A2E3B"/>
-                <w:sz w:val="20"/>
-              </w:rPr>
-              <w:t>Illustration on $100 of NOI</w:t>
-            </w:r>
-          </w:p>
-        </w:tc>
-        <w:tc>
-          <w:tcPr>
-            <w:tcW w:type="dxa" w:w="4680"/>
-            <w:shd w:fill="E8EEF2" w:val="clear"/>
-          </w:tcPr>
-          <w:p>
-            <w:pPr>
-              <w:spacing w:after="40" w:before="40"/>
-            </w:pPr>
-            <w:r>
-              <w:rPr>
-                <w:rFonts w:ascii="Calibri" w:hAnsi="Calibri"/>
-                <w:b/>
-                <w:i w:val="0"/>
-                <w:color w:val="1A2E3B"/>
-                <w:sz w:val="20"/>
-              </w:rPr>
-              <w:t>Amount</w:t>
-            </w:r>
-          </w:p>
-        </w:tc>
-      </w:tr>
-      <w:tr>
-        <w:tc>
-          <w:tcPr>
-            <w:tcW w:type="dxa" w:w="4680"/>
-          </w:tcPr>
-          <w:p>
-            <w:pPr>
-              <w:spacing w:after="40" w:before="40"/>
-            </w:pPr>
-            <w:r>
-              <w:rPr>
-                <w:rFonts w:ascii="Calibri" w:hAnsi="Calibri"/>
-                <w:b w:val="0"/>
-                <w:i w:val="0"/>
-                <w:color w:val="1A1A1A"/>
-                <w:sz w:val="20"/>
-              </w:rPr>
-              <w:t>UnbridledACTS (20%)</w:t>
-            </w:r>
-          </w:p>
-        </w:tc>
-        <w:tc>
-          <w:tcPr>
-            <w:tcW w:type="dxa" w:w="4680"/>
-          </w:tcPr>
-          <w:p>
-            <w:pPr>
-              <w:spacing w:after="40" w:before="40"/>
-            </w:pPr>
-            <w:r>
-              <w:rPr>
-                <w:rFonts w:ascii="Calibri" w:hAnsi="Calibri"/>
-                <w:b w:val="0"/>
-                <w:i w:val="0"/>
-                <w:color w:val="1A1A1A"/>
-                <w:sz w:val="20"/>
-              </w:rPr>
-              <w:t>$20</w:t>
-            </w:r>
-          </w:p>
-        </w:tc>
-      </w:tr>
-      <w:tr>
-        <w:tc>
-          <w:tcPr>
-            <w:tcW w:type="dxa" w:w="4680"/>
-          </w:tcPr>
-          <w:p>
-            <w:pPr>
-              <w:spacing w:after="40" w:before="40"/>
-            </w:pPr>
-            <w:r>
-              <w:rPr>
-                <w:rFonts w:ascii="Calibri" w:hAnsi="Calibri"/>
-                <w:b w:val="0"/>
-                <w:i w:val="0"/>
-                <w:color w:val="1A1A1A"/>
-                <w:sz w:val="20"/>
-              </w:rPr>
-              <w:t>Reinvestment (20%)</w:t>
-            </w:r>
-          </w:p>
-        </w:tc>
-        <w:tc>
-          <w:tcPr>
-            <w:tcW w:type="dxa" w:w="4680"/>
-          </w:tcPr>
-          <w:p>
-            <w:pPr>
-              <w:spacing w:after="40" w:before="40"/>
-            </w:pPr>
-            <w:r>
-              <w:rPr>
-                <w:rFonts w:ascii="Calibri" w:hAnsi="Calibri"/>
-                <w:b w:val="0"/>
-                <w:i w:val="0"/>
-                <w:color w:val="1A1A1A"/>
-                <w:sz w:val="20"/>
-              </w:rPr>
-              <w:t>$20</w:t>
-            </w:r>
-          </w:p>
-        </w:tc>
-      </w:tr>
-      <w:tr>
-        <w:tc>
-          <w:tcPr>
-            <w:tcW w:type="dxa" w:w="4680"/>
-          </w:tcPr>
-          <w:p>
-            <w:pPr>
-              <w:spacing w:after="40" w:before="40"/>
-            </w:pPr>
-            <w:r>
-              <w:rPr>
-                <w:rFonts w:ascii="Calibri" w:hAnsi="Calibri"/>
-                <w:b w:val="0"/>
-                <w:i w:val="0"/>
-                <w:color w:val="1A1A1A"/>
-                <w:sz w:val="20"/>
-              </w:rPr>
-              <w:t>People pool (60%)</w:t>
-            </w:r>
-          </w:p>
-        </w:tc>
-        <w:tc>
-          <w:tcPr>
-            <w:tcW w:type="dxa" w:w="4680"/>
-          </w:tcPr>
-          <w:p>
-            <w:pPr>
-              <w:spacing w:after="40" w:before="40"/>
-            </w:pPr>
-            <w:r>
-              <w:rPr>
-                <w:rFonts w:ascii="Calibri" w:hAnsi="Calibri"/>
-                <w:b w:val="0"/>
-                <w:i w:val="0"/>
-                <w:color w:val="1A1A1A"/>
-                <w:sz w:val="20"/>
-              </w:rPr>
-              <w:t>$60</w:t>
-            </w:r>
-          </w:p>
-        </w:tc>
-      </w:tr>
-      <w:tr>
-        <w:tc>
-          <w:tcPr>
-            <w:tcW w:type="dxa" w:w="4680"/>
-          </w:tcPr>
-          <w:p>
-            <w:pPr>
-              <w:spacing w:after="40" w:before="40"/>
-            </w:pPr>
-            <w:r>
-              <w:rPr>
-                <w:rFonts w:ascii="Calibri" w:hAnsi="Calibri"/>
-                <w:b/>
-                <w:i w:val="0"/>
-                <w:color w:val="1A1A1A"/>
-                <w:sz w:val="20"/>
-              </w:rPr>
-              <w:t>Your 10% of the 60% pool</w:t>
-            </w:r>
-          </w:p>
-        </w:tc>
-        <w:tc>
-          <w:tcPr>
-            <w:tcW w:type="dxa" w:w="4680"/>
-          </w:tcPr>
-          <w:p>
-            <w:pPr>
-              <w:spacing w:after="40" w:before="40"/>
-            </w:pPr>
-            <w:r>
-              <w:rPr>
-                <w:rFonts w:ascii="Calibri" w:hAnsi="Calibri"/>
-                <w:b/>
-                <w:i w:val="0"/>
-                <w:color w:val="1A1A1A"/>
-                <w:sz w:val="20"/>
-              </w:rPr>
-              <w:t>$6</w:t>
             </w:r>
           </w:p>
         </w:tc>
@@ -807,10 +518,55 @@
           <w:rFonts w:ascii="Calibri" w:hAnsi="Calibri"/>
           <w:b/>
           <w:i w:val="0"/>
-          <w:color w:val="1A2E3B"/>
-          <w:sz w:val="24"/>
+          <w:color w:val="182D09"/>
+          <w:sz w:val="22"/>
         </w:rPr>
-        <w:t>6.  Benefits, Time Off, and Office Cadence</w:t>
+        <w:t>PROFIT SHARE</w:t>
+      </w:r>
+    </w:p>
+    <w:p>
+      <w:pPr>
+        <w:spacing w:after="160" w:before="0" w:line="276" w:lineRule="auto"/>
+      </w:pPr>
+      <w:r>
+        <w:rPr>
+          <w:rFonts w:ascii="Calibri" w:hAnsi="Calibri"/>
+          <w:b w:val="0"/>
+          <w:i w:val="0"/>
+          <w:color w:val="4C3A23"/>
+          <w:sz w:val="22"/>
+        </w:rPr>
+        <w:t>Of net operating income, TJ's allocates 20% to philanthropy, 20% to reinvestment, and 60% to the people pool.</w:t>
+      </w:r>
+    </w:p>
+    <w:p>
+      <w:pPr>
+        <w:spacing w:after="160" w:before="0" w:line="276" w:lineRule="auto"/>
+      </w:pPr>
+      <w:r>
+        <w:rPr>
+          <w:rFonts w:ascii="Calibri" w:hAnsi="Calibri"/>
+          <w:b w:val="0"/>
+          <w:i w:val="0"/>
+          <w:color w:val="4C3A23"/>
+          <w:sz w:val="22"/>
+        </w:rPr>
+        <w:t>You receive 10% of that 60% people pool as a W-2 bonus. On $100 of net operating income, that is $6. If there is no positive net operating income, the bonus is $0.</w:t>
+      </w:r>
+    </w:p>
+    <w:p>
+      <w:pPr>
+        <w:spacing w:before="280" w:after="120"/>
+      </w:pPr>
+      <w:r>
+        <w:rPr>
+          <w:rFonts w:ascii="Calibri" w:hAnsi="Calibri"/>
+          <w:b/>
+          <w:i w:val="0"/>
+          <w:color w:val="182D09"/>
+          <w:sz w:val="22"/>
+        </w:rPr>
+        <w:t>BENEFITS AND TIME OFF</w:t>
       </w:r>
     </w:p>
     <w:p>
@@ -824,10 +580,10 @@
           <w:rFonts w:ascii="Calibri" w:hAnsi="Calibri"/>
           <w:b w:val="0"/>
           <w:i w:val="0"/>
-          <w:color w:val="1A1A1A"/>
+          <w:color w:val="4C3A23"/>
           <w:sz w:val="22"/>
         </w:rPr>
-        <w:t>The Company will not provide medical, dental, or vision insurance as part of this offer. You have declined company medical benefits.</w:t>
+        <w:t>No company medical, dental, or vision. You have declined those benefits.</w:t>
       </w:r>
     </w:p>
     <w:p>
@@ -841,10 +597,10 @@
           <w:rFonts w:ascii="Calibri" w:hAnsi="Calibri"/>
           <w:b w:val="0"/>
           <w:i w:val="0"/>
-          <w:color w:val="1A1A1A"/>
+          <w:color w:val="4C3A23"/>
           <w:sz w:val="22"/>
         </w:rPr>
-        <w:t>You are entitled to up to three (3) weeks of vacation per year, scheduled with ownership so mill coverage is maintained.</w:t>
+        <w:t>Up to three weeks of vacation a year, scheduled so coverage is maintained.</w:t>
       </w:r>
     </w:p>
     <w:p>
@@ -858,27 +614,10 @@
           <w:rFonts w:ascii="Calibri" w:hAnsi="Calibri"/>
           <w:b w:val="0"/>
           <w:i w:val="0"/>
-          <w:color w:val="1A1A1A"/>
+          <w:color w:val="4C3A23"/>
           <w:sz w:val="22"/>
         </w:rPr>
-        <w:t>The Company intends a six-day workweek in the office across the team. That is a team operating cadence. It is not a personal requirement that you work six days.</w:t>
-      </w:r>
-    </w:p>
-    <w:p>
-      <w:pPr>
-        <w:pStyle w:val="ListBullet"/>
-        <w:spacing w:after="60"/>
-        <w:ind w:left="504"/>
-      </w:pPr>
-      <w:r>
-        <w:rPr>
-          <w:rFonts w:ascii="Calibri" w:hAnsi="Calibri"/>
-          <w:b w:val="0"/>
-          <w:i w:val="0"/>
-          <w:color w:val="1A1A1A"/>
-          <w:sz w:val="22"/>
-        </w:rPr>
-        <w:t>The Company intends to classify the General Manager position as exempt, subject to counsel and FLSA confirmation.</w:t>
+        <w:t>The office runs a six-day workweek across the team. That is the team cadence. It is not a requirement that you work six days.</w:t>
       </w:r>
     </w:p>
     <w:p>
@@ -890,10 +629,10 @@
           <w:rFonts w:ascii="Calibri" w:hAnsi="Calibri"/>
           <w:b/>
           <w:i w:val="0"/>
-          <w:color w:val="1A2E3B"/>
-          <w:sz w:val="24"/>
+          <w:color w:val="182D09"/>
+          <w:sz w:val="22"/>
         </w:rPr>
-        <w:t>7.  At-Will, Contingencies, Confidentiality</w:t>
+        <w:t>EMPLOYMENT</w:t>
       </w:r>
     </w:p>
     <w:p>
@@ -905,10 +644,10 @@
           <w:rFonts w:ascii="Calibri" w:hAnsi="Calibri"/>
           <w:b w:val="0"/>
           <w:i w:val="0"/>
-          <w:color w:val="1A1A1A"/>
+          <w:color w:val="4C3A23"/>
           <w:sz w:val="22"/>
         </w:rPr>
-        <w:t>Employment is at-will under Colorado law. Either party may end the relationship at any time, with or without cause or notice. There is no non-compete (Colorado HB 22-1317).</w:t>
+        <w:t>Employment is at-will under Colorado law. Either of us may end it at any time.</w:t>
       </w:r>
     </w:p>
     <w:p>
@@ -920,55 +659,10 @@
           <w:rFonts w:ascii="Calibri" w:hAnsi="Calibri"/>
           <w:b w:val="0"/>
           <w:i w:val="0"/>
-          <w:color w:val="1A1A1A"/>
+          <w:color w:val="4C3A23"/>
           <w:sz w:val="22"/>
         </w:rPr>
-        <w:t>This offer is contingent on verification of your right to work in the United States, any background check the Company requires, and attorney review of this letter.</w:t>
-      </w:r>
-    </w:p>
-    <w:p>
-      <w:pPr>
-        <w:spacing w:after="160" w:before="0" w:line="276" w:lineRule="auto"/>
-      </w:pPr>
-      <w:r>
-        <w:rPr>
-          <w:rFonts w:ascii="Calibri" w:hAnsi="Calibri"/>
-          <w:b w:val="0"/>
-          <w:i w:val="0"/>
-          <w:color w:val="1A1A1A"/>
-          <w:sz w:val="22"/>
-        </w:rPr>
-        <w:t>You agree to keep confidential the Company's customer information, pricing, and plan sets.</w:t>
-      </w:r>
-    </w:p>
-    <w:p>
-      <w:pPr>
-        <w:spacing w:after="160" w:before="0" w:line="276" w:lineRule="auto"/>
-      </w:pPr>
-      <w:r>
-        <w:rPr>
-          <w:rFonts w:ascii="Calibri" w:hAnsi="Calibri"/>
-          <w:b w:val="0"/>
-          <w:i w:val="0"/>
-          <w:color w:val="1A1A1A"/>
-          <w:sz w:val="22"/>
-        </w:rPr>
-        <w:t>This letter contains the entire agreement regarding employment terms and supersedes prior discussions, including earlier K-1 / equity conversation notes. Changes require a later written amendment signed by both parties.</w:t>
-      </w:r>
-    </w:p>
-    <w:p>
-      <w:pPr>
-        <w:spacing w:after="160" w:before="0" w:line="276" w:lineRule="auto"/>
-      </w:pPr>
-      <w:r>
-        <w:rPr>
-          <w:rFonts w:ascii="Calibri" w:hAnsi="Calibri"/>
-          <w:b w:val="0"/>
-          <w:i w:val="0"/>
-          <w:color w:val="1A1A1A"/>
-          <w:sz w:val="22"/>
-        </w:rPr>
-        <w:t>Governing law: State of Colorado. Venue: Park County, Colorado (Bailey mill), unless counsel advises otherwise.</w:t>
+        <w:t>Keep customer information, pricing, and plan sets confidential.</w:t>
       </w:r>
     </w:p>
     <w:p>
@@ -980,259 +674,10 @@
           <w:rFonts w:ascii="Calibri" w:hAnsi="Calibri"/>
           <w:b/>
           <w:i w:val="0"/>
-          <w:color w:val="1A2E3B"/>
-          <w:sz w:val="24"/>
-        </w:rPr>
-        <w:t>8.  What This Is Not</w:t>
-      </w:r>
-    </w:p>
-    <w:p>
-      <w:pPr>
-        <w:pStyle w:val="ListBullet"/>
-        <w:spacing w:after="60"/>
-        <w:ind w:left="504"/>
-      </w:pPr>
-      <w:r>
-        <w:rPr>
-          <w:rFonts w:ascii="Calibri" w:hAnsi="Calibri"/>
-          <w:b w:val="0"/>
-          <w:i w:val="0"/>
-          <w:color w:val="1A1A1A"/>
+          <w:color w:val="182D09"/>
           <w:sz w:val="22"/>
         </w:rPr>
-        <w:t>Not executable until a licensed Colorado attorney reviews it and both parties countersign.</w:t>
-      </w:r>
-    </w:p>
-    <w:p>
-      <w:pPr>
-        <w:pStyle w:val="ListBullet"/>
-        <w:spacing w:after="60"/>
-        <w:ind w:left="504"/>
-      </w:pPr>
-      <w:r>
-        <w:rPr>
-          <w:rFonts w:ascii="Calibri" w:hAnsi="Calibri"/>
-          <w:b w:val="0"/>
-          <w:i w:val="0"/>
-          <w:color w:val="1A1A1A"/>
-          <w:sz w:val="22"/>
-        </w:rPr>
-        <w:t>Not a K-1. Not an Operating Agreement. Not a grant of units.</w:t>
-      </w:r>
-    </w:p>
-    <w:p>
-      <w:pPr>
-        <w:pStyle w:val="ListBullet"/>
-        <w:spacing w:after="60"/>
-        <w:ind w:left="504"/>
-      </w:pPr>
-      <w:r>
-        <w:rPr>
-          <w:rFonts w:ascii="Calibri" w:hAnsi="Calibri"/>
-          <w:b w:val="0"/>
-          <w:i w:val="0"/>
-          <w:color w:val="1A1A1A"/>
-          <w:sz w:val="22"/>
-        </w:rPr>
-        <w:t>Not the October 13 two-hire MOU and not the October 14 discussion page. Those stay as conversation history.</w:t>
-      </w:r>
-    </w:p>
-    <w:p>
-      <w:pPr>
-        <w:pStyle w:val="ListBullet"/>
-        <w:spacing w:after="60"/>
-        <w:ind w:left="504"/>
-      </w:pPr>
-      <w:r>
-        <w:rPr>
-          <w:rFonts w:ascii="Calibri" w:hAnsi="Calibri"/>
-          <w:b w:val="0"/>
-          <w:i w:val="0"/>
-          <w:color w:val="1A1A1A"/>
-          <w:sz w:val="22"/>
-        </w:rPr>
-        <w:t>Not a promise of $2,500,000 in revenue.</w:t>
-      </w:r>
-    </w:p>
-    <w:p>
-      <w:pPr>
-        <w:pStyle w:val="ListBullet"/>
-        <w:spacing w:after="60"/>
-        <w:ind w:left="504"/>
-      </w:pPr>
-      <w:r>
-        <w:rPr>
-          <w:rFonts w:ascii="Calibri" w:hAnsi="Calibri"/>
-          <w:b w:val="0"/>
-          <w:i w:val="0"/>
-          <w:color w:val="1A1A1A"/>
-          <w:sz w:val="22"/>
-        </w:rPr>
-        <w:t>Not company-paid medical.</w:t>
-      </w:r>
-    </w:p>
-    <w:p>
-      <w:pPr>
-        <w:pStyle w:val="ListBullet"/>
-        <w:spacing w:after="60"/>
-        <w:ind w:left="504"/>
-      </w:pPr>
-      <w:r>
-        <w:rPr>
-          <w:rFonts w:ascii="Calibri" w:hAnsi="Calibri"/>
-          <w:b w:val="0"/>
-          <w:i w:val="0"/>
-          <w:color w:val="1A1A1A"/>
-          <w:sz w:val="22"/>
-        </w:rPr>
-        <w:t>Not a requirement that Mike personally work a six-day week.</w:t>
-      </w:r>
-    </w:p>
-    <w:p>
-      <w:pPr>
-        <w:spacing w:before="280" w:after="120"/>
-      </w:pPr>
-      <w:r>
-        <w:rPr>
-          <w:rFonts w:ascii="Calibri" w:hAnsi="Calibri"/>
-          <w:b/>
-          <w:i w:val="0"/>
-          <w:color w:val="1A2E3B"/>
-          <w:sz w:val="24"/>
-        </w:rPr>
-        <w:t>9.  Open Items for Counsel</w:t>
-      </w:r>
-    </w:p>
-    <w:p>
-      <w:pPr>
-        <w:pStyle w:val="ListBullet"/>
-        <w:spacing w:after="60"/>
-        <w:ind w:left="504"/>
-      </w:pPr>
-      <w:r>
-        <w:rPr>
-          <w:rFonts w:ascii="Calibri" w:hAnsi="Calibri"/>
-          <w:b w:val="0"/>
-          <w:i w:val="0"/>
-          <w:color w:val="1A1A1A"/>
-          <w:sz w:val="22"/>
-        </w:rPr>
-        <w:t>Confirm TJ's Colorado SOS legal entity name.</w:t>
-      </w:r>
-    </w:p>
-    <w:p>
-      <w:pPr>
-        <w:pStyle w:val="ListBullet"/>
-        <w:spacing w:after="60"/>
-        <w:ind w:left="504"/>
-      </w:pPr>
-      <w:r>
-        <w:rPr>
-          <w:rFonts w:ascii="Calibri" w:hAnsi="Calibri"/>
-          <w:b w:val="0"/>
-          <w:i w:val="0"/>
-          <w:color w:val="1A1A1A"/>
-          <w:sz w:val="22"/>
-        </w:rPr>
-        <w:t>Confirm exact start date.</w:t>
-      </w:r>
-    </w:p>
-    <w:p>
-      <w:pPr>
-        <w:pStyle w:val="ListBullet"/>
-        <w:spacing w:after="60"/>
-        <w:ind w:left="504"/>
-      </w:pPr>
-      <w:r>
-        <w:rPr>
-          <w:rFonts w:ascii="Calibri" w:hAnsi="Calibri"/>
-          <w:b w:val="0"/>
-          <w:i w:val="0"/>
-          <w:color w:val="1A1A1A"/>
-          <w:sz w:val="22"/>
-        </w:rPr>
-        <w:t>Lock NOI definition and year-end bonus timing.</w:t>
-      </w:r>
-    </w:p>
-    <w:p>
-      <w:pPr>
-        <w:pStyle w:val="ListBullet"/>
-        <w:spacing w:after="60"/>
-        <w:ind w:left="504"/>
-      </w:pPr>
-      <w:r>
-        <w:rPr>
-          <w:rFonts w:ascii="Calibri" w:hAnsi="Calibri"/>
-          <w:b w:val="0"/>
-          <w:i w:val="0"/>
-          <w:color w:val="1A1A1A"/>
-          <w:sz w:val="22"/>
-        </w:rPr>
-        <w:t>Lock commission pay timing (when a job's GPM is known; deposit vs close).</w:t>
-      </w:r>
-    </w:p>
-    <w:p>
-      <w:pPr>
-        <w:pStyle w:val="ListBullet"/>
-        <w:spacing w:after="60"/>
-        <w:ind w:left="504"/>
-      </w:pPr>
-      <w:r>
-        <w:rPr>
-          <w:rFonts w:ascii="Calibri" w:hAnsi="Calibri"/>
-          <w:b w:val="0"/>
-          <w:i w:val="0"/>
-          <w:color w:val="1A1A1A"/>
-          <w:sz w:val="22"/>
-        </w:rPr>
-        <w:t>Confirm exempt classification (FLSA / Colorado duties test).</w:t>
-      </w:r>
-    </w:p>
-    <w:p>
-      <w:pPr>
-        <w:pStyle w:val="ListBullet"/>
-        <w:spacing w:after="60"/>
-        <w:ind w:left="504"/>
-      </w:pPr>
-      <w:r>
-        <w:rPr>
-          <w:rFonts w:ascii="Calibri" w:hAnsi="Calibri"/>
-          <w:b w:val="0"/>
-          <w:i w:val="0"/>
-          <w:color w:val="1A1A1A"/>
-          <w:sz w:val="22"/>
-        </w:rPr>
-        <w:t>Confirm Park County venue.</w:t>
-      </w:r>
-    </w:p>
-    <w:p>
-      <w:pPr>
-        <w:spacing w:before="280" w:after="120"/>
-      </w:pPr>
-      <w:r>
-        <w:rPr>
-          <w:rFonts w:ascii="Calibri" w:hAnsi="Calibri"/>
-          <w:b/>
-          <w:i w:val="0"/>
-          <w:color w:val="1A2E3B"/>
-          <w:sz w:val="24"/>
-        </w:rPr>
-        <w:t>10.  Acknowledgment of Draft</w:t>
-      </w:r>
-    </w:p>
-    <w:p>
-      <w:pPr>
-        <w:spacing w:after="160" w:before="0" w:line="276" w:lineRule="auto"/>
-      </w:pPr>
-      <w:r>
-        <w:rPr>
-          <w:rFonts w:ascii="Calibri" w:hAnsi="Calibri"/>
-          <w:b w:val="0"/>
-          <w:i w:val="0"/>
-          <w:color w:val="1A1A1A"/>
-          <w:sz w:val="22"/>
-        </w:rPr>
-        <w:t>Signatures below acknowledge receipt of this draft only. They do not execute employment until attorney review and a later countersigned original.</w:t>
+        <w:t>SIGNATURES</w:t>
       </w:r>
     </w:p>
     <w:p>
@@ -1244,7 +689,7 @@
           <w:rFonts w:ascii="Calibri" w:hAnsi="Calibri"/>
           <w:b/>
           <w:i w:val="0"/>
-          <w:color w:val="1A1A1A"/>
+          <w:color w:val="4C3A23"/>
           <w:sz w:val="22"/>
         </w:rPr>
         <w:t>Stan Bullis</w:t>
@@ -1259,10 +704,10 @@
           <w:rFonts w:ascii="Calibri" w:hAnsi="Calibri"/>
           <w:b w:val="0"/>
           <w:i w:val="0"/>
-          <w:color w:val="4A555A"/>
+          <w:color w:val="6A5A42"/>
           <w:sz w:val="20"/>
         </w:rPr>
-        <w:t>President, TJ's Log &amp; Timber (entity TBD)</w:t>
+        <w:t>Partner, TJ's Log &amp; Timber</w:t>
       </w:r>
     </w:p>
     <w:p>
@@ -1274,7 +719,7 @@
           <w:rFonts w:ascii="Calibri" w:hAnsi="Calibri"/>
           <w:b w:val="0"/>
           <w:i w:val="0"/>
-          <w:color w:val="1A1A1A"/>
+          <w:color w:val="4C3A23"/>
           <w:sz w:val="22"/>
         </w:rPr>
         <w:t>Signature: ________________________________</w:t>
@@ -1289,7 +734,7 @@
           <w:rFonts w:ascii="Calibri" w:hAnsi="Calibri"/>
           <w:b w:val="0"/>
           <w:i w:val="0"/>
-          <w:color w:val="1A1A1A"/>
+          <w:color w:val="4C3A23"/>
           <w:sz w:val="22"/>
         </w:rPr>
         <w:t>Date: ________________________________</w:t>
@@ -1304,7 +749,7 @@
           <w:rFonts w:ascii="Calibri" w:hAnsi="Calibri"/>
           <w:b/>
           <w:i w:val="0"/>
-          <w:color w:val="1A1A1A"/>
+          <w:color w:val="4C3A23"/>
           <w:sz w:val="22"/>
         </w:rPr>
         <w:t>Mike Gustafson</w:t>
@@ -1319,10 +764,10 @@
           <w:rFonts w:ascii="Calibri" w:hAnsi="Calibri"/>
           <w:b w:val="0"/>
           <w:i w:val="0"/>
-          <w:color w:val="4A555A"/>
+          <w:color w:val="6A5A42"/>
           <w:sz w:val="20"/>
         </w:rPr>
-        <w:t>Proposed General Manager, W-2</w:t>
+        <w:t>General Manager, W-2</w:t>
       </w:r>
     </w:p>
     <w:p>
@@ -1334,7 +779,7 @@
           <w:rFonts w:ascii="Calibri" w:hAnsi="Calibri"/>
           <w:b w:val="0"/>
           <w:i w:val="0"/>
-          <w:color w:val="1A1A1A"/>
+          <w:color w:val="4C3A23"/>
           <w:sz w:val="22"/>
         </w:rPr>
         <w:t>Signature: ________________________________</w:t>
@@ -1346,7 +791,7 @@
           <w:rFonts w:ascii="Calibri" w:hAnsi="Calibri"/>
           <w:b w:val="0"/>
           <w:i w:val="0"/>
-          <w:color w:val="1A1A1A"/>
+          <w:color w:val="4C3A23"/>
           <w:sz w:val="22"/>
         </w:rPr>
         <w:t>Date: ________________________________</w:t>
@@ -1355,7 +800,7 @@
     <w:sectPr>
       <w:footerReference w:type="default" r:id="rId9"/>
       <w:pgSz w:w="12240" w:h="15840"/>
-      <w:pgMar w:top="1224" w:right="1440" w:bottom="1224" w:left="1440" w:header="720" w:footer="720" w:gutter="0"/>
+      <w:pgMar w:top="1080" w:right="1440" w:bottom="1080" w:left="1440" w:header="720" w:footer="720" w:gutter="0"/>
       <w:cols w:space="720"/>
       <w:docGrid w:linePitch="360"/>
     </w:sectPr>
@@ -1374,10 +819,10 @@
       <w:rPr>
         <w:rFonts w:ascii="Calibri" w:hAnsi="Calibri"/>
         <w:i/>
-        <w:color w:val="4A555A"/>
+        <w:color w:val="6A5A42"/>
         <w:sz w:val="16"/>
       </w:rPr>
-      <w:t>DRAFT · NOT FOR EXECUTION · 19 Oct 2026 · Attorney review required</w:t>
+      <w:t>TJ's Log &amp; Timber  ·  Bailey, Colorado  ·  19 October 2026</w:t>
     </w:r>
   </w:p>
 </w:ftr>

</xml_diff>